<commit_message>
docs(eda): add conceptual decision trees section to EDA report
</commit_message>
<xml_diff>
--- a/Informe parcial EDA.docx
+++ b/Informe parcial EDA.docx
@@ -60,21 +60,30 @@
           <w:i/>
           <w:iCs/>
         </w:rPr>
-        <w:t xml:space="preserve"> Authentication</w:t>
-      </w:r>
-      <w:r>
-        <w:t xml:space="preserve"> - RBA). </w:t>
-      </w:r>
-    </w:p>
-    <w:p>
-      <w:r>
-        <w:t>A través de la refactorización modular del pipeline (fase03_pipeline_v4.py) y una auditoría rigurosa mediante gráficos y matrices de diagnóstico (Figuras M1, D1 a D9), se validaron las hipótesis de ingeniería de características, los controles de aislamiento anti-fuga de información (</w:t>
-      </w:r>
+        <w:t xml:space="preserve"> </w:t>
+      </w:r>
+      <w:proofErr w:type="spellStart"/>
       <w:r>
         <w:rPr>
           <w:i/>
           <w:iCs/>
         </w:rPr>
+        <w:t>Authentication</w:t>
+      </w:r>
+      <w:proofErr w:type="spellEnd"/>
+      <w:r>
+        <w:t xml:space="preserve"> - RBA). </w:t>
+      </w:r>
+    </w:p>
+    <w:p>
+      <w:r>
+        <w:t>A través de la refactorización modular del pipeline (fase03_pipeline_v4.py) y una auditoría rigurosa mediante gráficos y matrices de diagnóstico (Figuras M1, D1 a D9), se validaron las hipótesis de ingeniería de características, los controles de aislamiento anti-fuga de información (</w:t>
+      </w:r>
+      <w:r>
+        <w:rPr>
+          <w:i/>
+          <w:iCs/>
+        </w:rPr>
         <w:t>anti-leakage</w:t>
       </w:r>
       <w:r>
@@ -106,10 +115,18 @@
       </w:r>
       <w:proofErr w:type="spellEnd"/>
       <w:r>
-        <w:t xml:space="preserve">, Open/Closed, </w:t>
+        <w:t>, Open/</w:t>
       </w:r>
       <w:proofErr w:type="spellStart"/>
       <w:r>
+        <w:t>Closed</w:t>
+      </w:r>
+      <w:proofErr w:type="spellEnd"/>
+      <w:r>
+        <w:t xml:space="preserve">, </w:t>
+      </w:r>
+      <w:proofErr w:type="spellStart"/>
+      <w:r>
         <w:t>Dependency</w:t>
       </w:r>
       <w:proofErr w:type="spellEnd"/>
@@ -319,7 +336,15 @@
       </w:r>
       <w:proofErr w:type="spellEnd"/>
       <w:r>
-        <w:t xml:space="preserve"> IPinfo (</w:t>
+        <w:t xml:space="preserve"> </w:t>
+      </w:r>
+      <w:proofErr w:type="spellStart"/>
+      <w:r>
+        <w:t>IPinfo</w:t>
+      </w:r>
+      <w:proofErr w:type="spellEnd"/>
+      <w:r>
+        <w:t xml:space="preserve"> (</w:t>
       </w:r>
       <w:proofErr w:type="spellStart"/>
       <w:r>
@@ -505,7 +530,31 @@
       </w:r>
       <w:proofErr w:type="spellEnd"/>
       <w:r>
-        <w:t xml:space="preserve">("Is Account Takeover")) antes de ejecutar las transformaciones en features.py, reincorporándola exclusivamente al momento de la validación final. </w:t>
+        <w:t>("</w:t>
+      </w:r>
+      <w:proofErr w:type="spellStart"/>
+      <w:r>
+        <w:t>Is</w:t>
+      </w:r>
+      <w:proofErr w:type="spellEnd"/>
+      <w:r>
+        <w:t xml:space="preserve"> </w:t>
+      </w:r>
+      <w:proofErr w:type="spellStart"/>
+      <w:r>
+        <w:t>Account</w:t>
+      </w:r>
+      <w:proofErr w:type="spellEnd"/>
+      <w:r>
+        <w:t xml:space="preserve"> </w:t>
+      </w:r>
+      <w:proofErr w:type="spellStart"/>
+      <w:r>
+        <w:t>Takeover</w:t>
+      </w:r>
+      <w:proofErr w:type="spellEnd"/>
+      <w:r>
+        <w:t xml:space="preserve">")) antes de ejecutar las transformaciones en features.py, reincorporándola exclusivamente al momento de la validación final. </w:t>
       </w:r>
     </w:p>
     <w:p>
@@ -556,7 +605,7 @@
           <w:noProof/>
         </w:rPr>
         <w:drawing>
-          <wp:inline distT="0" distB="0" distL="0" distR="0" wp14:anchorId="3390047E" wp14:editId="7C8A6072">
+          <wp:inline distT="0" distB="0" distL="0" distR="0" wp14:anchorId="3390047E" wp14:editId="1AA65A80">
             <wp:extent cx="5612130" cy="3292475"/>
             <wp:effectExtent l="0" t="0" r="7620" b="3175"/>
             <wp:docPr id="180286296" name="Imagen 1"/>
@@ -767,6 +816,7 @@
         <w:rPr>
           <w:i/>
           <w:iCs/>
+          <w:noProof/>
         </w:rPr>
         <w:lastRenderedPageBreak/>
         <w:drawing>
@@ -830,6 +880,7 @@
         <w:rPr>
           <w:i/>
           <w:iCs/>
+          <w:noProof/>
         </w:rPr>
         <w:drawing>
           <wp:inline distT="0" distB="0" distL="0" distR="0" wp14:anchorId="5983ECE3" wp14:editId="1BA9898A">
@@ -1029,6 +1080,7 @@
         <w:rPr>
           <w:i/>
           <w:iCs/>
+          <w:noProof/>
         </w:rPr>
         <w:drawing>
           <wp:inline distT="0" distB="0" distL="0" distR="0" wp14:anchorId="4C1B047F" wp14:editId="4CDBBEEC">
@@ -1252,9 +1304,10 @@
         <w:rPr>
           <w:i/>
           <w:iCs/>
+          <w:noProof/>
         </w:rPr>
         <w:drawing>
-          <wp:inline distT="0" distB="0" distL="0" distR="0" wp14:anchorId="1021F38B" wp14:editId="1CADA691">
+          <wp:inline distT="0" distB="0" distL="0" distR="0" wp14:anchorId="1021F38B" wp14:editId="0E2ACA7A">
             <wp:extent cx="5612130" cy="2397125"/>
             <wp:effectExtent l="0" t="0" r="7620" b="3175"/>
             <wp:docPr id="2075610442" name="Imagen 10"/>
@@ -1486,6 +1539,7 @@
         <w:rPr>
           <w:i/>
           <w:iCs/>
+          <w:noProof/>
         </w:rPr>
         <w:drawing>
           <wp:inline distT="0" distB="0" distL="0" distR="0" wp14:anchorId="0D8A3B7C" wp14:editId="57240A58">
@@ -1742,6 +1796,7 @@
         <w:rPr>
           <w:i/>
           <w:iCs/>
+          <w:noProof/>
         </w:rPr>
         <w:drawing>
           <wp:inline distT="0" distB="0" distL="0" distR="0" wp14:anchorId="2193D0AD" wp14:editId="6201111B">
@@ -1902,9 +1957,10 @@
         <w:rPr>
           <w:i/>
           <w:iCs/>
+          <w:noProof/>
         </w:rPr>
         <w:drawing>
-          <wp:inline distT="0" distB="0" distL="0" distR="0" wp14:anchorId="7D1584CB" wp14:editId="56D57CDD">
+          <wp:inline distT="0" distB="0" distL="0" distR="0" wp14:anchorId="7D1584CB" wp14:editId="766B51B7">
             <wp:extent cx="5612130" cy="2214245"/>
             <wp:effectExtent l="0" t="0" r="7620" b="0"/>
             <wp:docPr id="67236525" name="Imagen 16"/>
@@ -2037,6 +2093,740 @@
           <w:bCs/>
         </w:rPr>
       </w:pPr>
+    </w:p>
+    <w:p>
+      <w:pPr>
+        <w:rPr>
+          <w:b/>
+          <w:bCs/>
+        </w:rPr>
+      </w:pPr>
+    </w:p>
+    <w:p>
+      <w:pPr>
+        <w:rPr>
+          <w:b/>
+          <w:bCs/>
+        </w:rPr>
+      </w:pPr>
+    </w:p>
+    <w:p>
+      <w:pPr>
+        <w:rPr>
+          <w:b/>
+          <w:bCs/>
+        </w:rPr>
+      </w:pPr>
+    </w:p>
+    <w:p>
+      <w:pPr>
+        <w:rPr>
+          <w:b/>
+          <w:bCs/>
+        </w:rPr>
+      </w:pPr>
+    </w:p>
+    <w:p>
+      <w:pPr>
+        <w:rPr>
+          <w:b/>
+          <w:bCs/>
+        </w:rPr>
+      </w:pPr>
+    </w:p>
+    <w:p>
+      <w:pPr>
+        <w:rPr>
+          <w:b/>
+          <w:bCs/>
+        </w:rPr>
+      </w:pPr>
+    </w:p>
+    <w:p>
+      <w:pPr>
+        <w:rPr>
+          <w:b/>
+          <w:bCs/>
+        </w:rPr>
+      </w:pPr>
+    </w:p>
+    <w:p>
+      <w:pPr>
+        <w:rPr>
+          <w:b/>
+          <w:bCs/>
+        </w:rPr>
+      </w:pPr>
+    </w:p>
+    <w:p>
+      <w:pPr>
+        <w:rPr>
+          <w:b/>
+          <w:bCs/>
+        </w:rPr>
+      </w:pPr>
+    </w:p>
+    <w:p>
+      <w:pPr>
+        <w:rPr>
+          <w:b/>
+          <w:bCs/>
+        </w:rPr>
+      </w:pPr>
+    </w:p>
+    <w:p>
+      <w:pPr>
+        <w:rPr>
+          <w:b/>
+          <w:bCs/>
+        </w:rPr>
+      </w:pPr>
+      <w:r>
+        <w:rPr>
+          <w:b/>
+          <w:bCs/>
+        </w:rPr>
+        <w:lastRenderedPageBreak/>
+        <w:t>3.8. Árboles de Decisión Conceptuales (Ejemplos Didácticos)</w:t>
+      </w:r>
+    </w:p>
+    <w:p>
+      <w:r>
+        <w:t>Los siguientes cinco árboles son ilustraciones didácticas del razonamiento de un analista de seguridad. No son modelos entrenados ni se derivan de los datos; su propósito es explicar cómo podrían combinarse las señales analizadas en el EDA.</w:t>
+      </w:r>
+    </w:p>
+    <w:p>
+      <w:pPr>
+        <w:rPr>
+          <w:b/>
+          <w:bCs/>
+        </w:rPr>
+      </w:pPr>
+      <w:r>
+        <w:rPr>
+          <w:b/>
+          <w:bCs/>
+        </w:rPr>
+        <w:t>Árbol 1 · Fuerza bruta: intentos fallidos en poco tiempo</w:t>
+      </w:r>
+    </w:p>
+    <w:p>
+      <w:pPr>
+        <w:rPr>
+          <w:b/>
+          <w:bCs/>
+        </w:rPr>
+      </w:pPr>
+      <w:r>
+        <w:rPr>
+          <w:b/>
+          <w:bCs/>
+        </w:rPr>
+        <w:drawing>
+          <wp:inline distT="0" distB="0" distL="0" distR="0" wp14:anchorId="35C94CD3" wp14:editId="43C8F4AF">
+            <wp:extent cx="5612130" cy="2384425"/>
+            <wp:effectExtent l="0" t="0" r="7620" b="0"/>
+            <wp:docPr id="3" name="Image 0" descr="Árbol 1: intentos fallidos: ejemplo didáctico, no es un modelo entrenado"/>
+            <wp:cNvGraphicFramePr>
+              <a:graphicFrameLocks xmlns:a="http://schemas.openxmlformats.org/drawingml/2006/main" noChangeAspect="1"/>
+            </wp:cNvGraphicFramePr>
+            <a:graphic xmlns:a="http://schemas.openxmlformats.org/drawingml/2006/main">
+              <a:graphicData uri="http://schemas.openxmlformats.org/drawingml/2006/picture">
+                <pic:pic xmlns:pic="http://schemas.openxmlformats.org/drawingml/2006/picture">
+                  <pic:nvPicPr>
+                    <pic:cNvPr id="3" name="Image 0" descr="Árbol 1: intentos fallidos: ejemplo didáctico, no es un modelo entrenado"/>
+                    <pic:cNvPicPr>
+                      <a:picLocks noChangeAspect="1"/>
+                    </pic:cNvPicPr>
+                  </pic:nvPicPr>
+                  <pic:blipFill>
+                    <a:blip r:embed="rId13"/>
+                    <a:srcRect/>
+                    <a:stretch/>
+                  </pic:blipFill>
+                  <pic:spPr>
+                    <a:xfrm>
+                      <a:off x="0" y="0"/>
+                      <a:ext cx="5612130" cy="2384425"/>
+                    </a:xfrm>
+                    <a:prstGeom prst="rect">
+                      <a:avLst/>
+                    </a:prstGeom>
+                  </pic:spPr>
+                </pic:pic>
+              </a:graphicData>
+            </a:graphic>
+          </wp:inline>
+        </w:drawing>
+      </w:r>
+    </w:p>
+    <w:p/>
+    <w:p>
+      <w:pPr>
+        <w:numPr>
+          <w:ilvl w:val="0"/>
+          <w:numId w:val="7"/>
+        </w:numPr>
+      </w:pPr>
+      <w:r>
+        <w:rPr>
+          <w:b/>
+          <w:bCs/>
+        </w:rPr>
+        <w:t>Lógica de decisión:</w:t>
+      </w:r>
+      <w:r>
+        <w:t xml:space="preserve"> Evalúa si hubo 3 o más fallos de inicio de sesión en los últimos 15 minutos y si el intento actual tuvo éxito. Un acceso exitoso tras varios fallos se marca como posible fuerza bruta conseguida y requiere revisión inmediata.</w:t>
+      </w:r>
+    </w:p>
+    <w:p>
+      <w:pPr>
+        <w:numPr>
+          <w:ilvl w:val="0"/>
+          <w:numId w:val="7"/>
+        </w:numPr>
+      </w:pPr>
+      <w:r>
+        <w:rPr>
+          <w:b/>
+          <w:bCs/>
+        </w:rPr>
+        <w:t>Evidencia y limitaciones:</w:t>
+      </w:r>
+      <w:r>
+        <w:t xml:space="preserve"> El umbral de 3 intentos es ilustrativo y no fue validado. En el EDA (D4), 7 de 45 eventos ATO tenían al menos un fallo previo en 15 minutos.</w:t>
+      </w:r>
+    </w:p>
+    <w:p/>
+    <w:p>
+      <w:pPr>
+        <w:rPr>
+          <w:b/>
+          <w:bCs/>
+        </w:rPr>
+      </w:pPr>
+    </w:p>
+    <w:p>
+      <w:pPr>
+        <w:rPr>
+          <w:b/>
+          <w:bCs/>
+        </w:rPr>
+      </w:pPr>
+    </w:p>
+    <w:p>
+      <w:pPr>
+        <w:rPr>
+          <w:b/>
+          <w:bCs/>
+        </w:rPr>
+      </w:pPr>
+    </w:p>
+    <w:p>
+      <w:pPr>
+        <w:rPr>
+          <w:b/>
+          <w:bCs/>
+        </w:rPr>
+      </w:pPr>
+    </w:p>
+    <w:p>
+      <w:pPr>
+        <w:rPr>
+          <w:b/>
+          <w:bCs/>
+        </w:rPr>
+      </w:pPr>
+    </w:p>
+    <w:p>
+      <w:pPr>
+        <w:rPr>
+          <w:b/>
+          <w:bCs/>
+        </w:rPr>
+      </w:pPr>
+    </w:p>
+    <w:p>
+      <w:pPr>
+        <w:rPr>
+          <w:b/>
+          <w:bCs/>
+        </w:rPr>
+      </w:pPr>
+      <w:r>
+        <w:rPr>
+          <w:b/>
+          <w:bCs/>
+        </w:rPr>
+        <w:lastRenderedPageBreak/>
+        <w:t>Árbol 2 · Viaje imposible: ubicación frente al acceso anterior</w:t>
+      </w:r>
+    </w:p>
+    <w:p>
+      <w:pPr>
+        <w:rPr>
+          <w:b/>
+          <w:bCs/>
+        </w:rPr>
+      </w:pPr>
+      <w:r>
+        <w:rPr>
+          <w:b/>
+          <w:bCs/>
+        </w:rPr>
+        <w:drawing>
+          <wp:inline distT="0" distB="0" distL="0" distR="0" wp14:anchorId="025B1F84" wp14:editId="7299240F">
+            <wp:extent cx="5612130" cy="2384425"/>
+            <wp:effectExtent l="0" t="0" r="7620" b="0"/>
+            <wp:docPr id="4" name="Image 1" descr="Árbol 2: ubicación: ejemplo didáctico, no es un modelo entrenado"/>
+            <wp:cNvGraphicFramePr>
+              <a:graphicFrameLocks xmlns:a="http://schemas.openxmlformats.org/drawingml/2006/main" noChangeAspect="1"/>
+            </wp:cNvGraphicFramePr>
+            <a:graphic xmlns:a="http://schemas.openxmlformats.org/drawingml/2006/main">
+              <a:graphicData uri="http://schemas.openxmlformats.org/drawingml/2006/picture">
+                <pic:pic xmlns:pic="http://schemas.openxmlformats.org/drawingml/2006/picture">
+                  <pic:nvPicPr>
+                    <pic:cNvPr id="4" name="Image 1" descr="Árbol 2: ubicación: ejemplo didáctico, no es un modelo entrenado"/>
+                    <pic:cNvPicPr>
+                      <a:picLocks noChangeAspect="1"/>
+                    </pic:cNvPicPr>
+                  </pic:nvPicPr>
+                  <pic:blipFill>
+                    <a:blip r:embed="rId14"/>
+                    <a:srcRect/>
+                    <a:stretch/>
+                  </pic:blipFill>
+                  <pic:spPr>
+                    <a:xfrm>
+                      <a:off x="0" y="0"/>
+                      <a:ext cx="5612130" cy="2384425"/>
+                    </a:xfrm>
+                    <a:prstGeom prst="rect">
+                      <a:avLst/>
+                    </a:prstGeom>
+                  </pic:spPr>
+                </pic:pic>
+              </a:graphicData>
+            </a:graphic>
+          </wp:inline>
+        </w:drawing>
+      </w:r>
+    </w:p>
+    <w:p>
+      <w:pPr>
+        <w:numPr>
+          <w:ilvl w:val="0"/>
+          <w:numId w:val="7"/>
+        </w:numPr>
+      </w:pPr>
+      <w:r>
+        <w:rPr>
+          <w:b/>
+          <w:bCs/>
+        </w:rPr>
+        <w:t>Lógica de decisión:</w:t>
+      </w:r>
+      <w:r>
+        <w:t xml:space="preserve"> Compara el país actual con el del acceso anterior y genera una alerta si la velocidad necesaria supera 800 km/h en menos de 12 horas. Distingue el primer acceso y la información insuficiente del acceso normal.</w:t>
+      </w:r>
+    </w:p>
+    <w:p>
+      <w:pPr>
+        <w:numPr>
+          <w:ilvl w:val="0"/>
+          <w:numId w:val="7"/>
+        </w:numPr>
+      </w:pPr>
+      <w:r>
+        <w:rPr>
+          <w:b/>
+          <w:bCs/>
+        </w:rPr>
+        <w:t>Evidencia y limitaciones:</w:t>
+      </w:r>
+      <w:r>
+        <w:t xml:space="preserve"> El movimiento solo es evaluable en el 11,9 % de los eventos (6.811 de 57.420, D3); un caso no evaluable no equivale a un acceso normal.</w:t>
+      </w:r>
+    </w:p>
+    <w:p/>
+    <w:p>
+      <w:pPr>
+        <w:rPr>
+          <w:b/>
+          <w:bCs/>
+        </w:rPr>
+      </w:pPr>
+      <w:r>
+        <w:rPr>
+          <w:b/>
+          <w:bCs/>
+        </w:rPr>
+        <w:t>Árbol 3 · Reputación de la IP</w:t>
+      </w:r>
+    </w:p>
+    <w:p>
+      <w:pPr>
+        <w:rPr>
+          <w:b/>
+          <w:bCs/>
+        </w:rPr>
+      </w:pPr>
+      <w:r>
+        <w:rPr>
+          <w:b/>
+          <w:bCs/>
+        </w:rPr>
+        <w:drawing>
+          <wp:inline distT="0" distB="0" distL="0" distR="0" wp14:anchorId="40E76AC9" wp14:editId="129849F3">
+            <wp:extent cx="5612130" cy="2384425"/>
+            <wp:effectExtent l="0" t="0" r="7620" b="0"/>
+            <wp:docPr id="5" name="Image 2" descr="Árbol 3: reputación de IP: ejemplo didáctico, no es un modelo entrenado"/>
+            <wp:cNvGraphicFramePr>
+              <a:graphicFrameLocks xmlns:a="http://schemas.openxmlformats.org/drawingml/2006/main" noChangeAspect="1"/>
+            </wp:cNvGraphicFramePr>
+            <a:graphic xmlns:a="http://schemas.openxmlformats.org/drawingml/2006/main">
+              <a:graphicData uri="http://schemas.openxmlformats.org/drawingml/2006/picture">
+                <pic:pic xmlns:pic="http://schemas.openxmlformats.org/drawingml/2006/picture">
+                  <pic:nvPicPr>
+                    <pic:cNvPr id="5" name="Image 2" descr="Árbol 3: reputación de IP: ejemplo didáctico, no es un modelo entrenado"/>
+                    <pic:cNvPicPr>
+                      <a:picLocks noChangeAspect="1"/>
+                    </pic:cNvPicPr>
+                  </pic:nvPicPr>
+                  <pic:blipFill>
+                    <a:blip r:embed="rId15"/>
+                    <a:srcRect/>
+                    <a:stretch/>
+                  </pic:blipFill>
+                  <pic:spPr>
+                    <a:xfrm>
+                      <a:off x="0" y="0"/>
+                      <a:ext cx="5612130" cy="2384425"/>
+                    </a:xfrm>
+                    <a:prstGeom prst="rect">
+                      <a:avLst/>
+                    </a:prstGeom>
+                  </pic:spPr>
+                </pic:pic>
+              </a:graphicData>
+            </a:graphic>
+          </wp:inline>
+        </w:drawing>
+      </w:r>
+    </w:p>
+    <w:p>
+      <w:pPr>
+        <w:numPr>
+          <w:ilvl w:val="0"/>
+          <w:numId w:val="7"/>
+        </w:numPr>
+      </w:pPr>
+      <w:r>
+        <w:rPr>
+          <w:b/>
+          <w:bCs/>
+        </w:rPr>
+        <w:t>Lógica de decisión:</w:t>
+      </w:r>
+      <w:r>
+        <w:t xml:space="preserve"> Verifica si la IP figura en la lista de atacantes conocidos y si el acceso fue exitoso, priorizando los accesos exitosos desde IP hostiles.</w:t>
+      </w:r>
+    </w:p>
+    <w:p>
+      <w:pPr>
+        <w:numPr>
+          <w:ilvl w:val="0"/>
+          <w:numId w:val="7"/>
+        </w:numPr>
+      </w:pPr>
+      <w:r>
+        <w:rPr>
+          <w:b/>
+          <w:bCs/>
+        </w:rPr>
+        <w:lastRenderedPageBreak/>
+        <w:t>Evidencia y limitaciones:</w:t>
+      </w:r>
+      <w:r>
+        <w:t xml:space="preserve"> La ausencia de bandera no descarta riesgo: ninguno de los 45 eventos ATO tenía Is Attack IP activa (D7). La validez de esta variable sigue pendiente de validación conceptual.</w:t>
+      </w:r>
+    </w:p>
+    <w:p>
+      <w:pPr>
+        <w:rPr>
+          <w:b/>
+          <w:bCs/>
+        </w:rPr>
+      </w:pPr>
+      <w:r>
+        <w:rPr>
+          <w:b/>
+          <w:bCs/>
+        </w:rPr>
+        <w:t>Árbol 4 · Horario del acceso fuera de turno</w:t>
+      </w:r>
+    </w:p>
+    <w:p>
+      <w:pPr>
+        <w:rPr>
+          <w:b/>
+          <w:bCs/>
+        </w:rPr>
+      </w:pPr>
+      <w:r>
+        <w:rPr>
+          <w:b/>
+          <w:bCs/>
+        </w:rPr>
+        <w:drawing>
+          <wp:inline distT="0" distB="0" distL="0" distR="0" wp14:anchorId="5FF41AA2" wp14:editId="1650D432">
+            <wp:extent cx="6205477" cy="2636520"/>
+            <wp:effectExtent l="0" t="0" r="5080" b="0"/>
+            <wp:docPr id="6" name="Image 3" descr="Árbol 4: horario: ejemplo didáctico, no es un modelo entrenado"/>
+            <wp:cNvGraphicFramePr>
+              <a:graphicFrameLocks xmlns:a="http://schemas.openxmlformats.org/drawingml/2006/main" noChangeAspect="1"/>
+            </wp:cNvGraphicFramePr>
+            <a:graphic xmlns:a="http://schemas.openxmlformats.org/drawingml/2006/main">
+              <a:graphicData uri="http://schemas.openxmlformats.org/drawingml/2006/picture">
+                <pic:pic xmlns:pic="http://schemas.openxmlformats.org/drawingml/2006/picture">
+                  <pic:nvPicPr>
+                    <pic:cNvPr id="6" name="Image 3" descr="Árbol 4: horario: ejemplo didáctico, no es un modelo entrenado"/>
+                    <pic:cNvPicPr>
+                      <a:picLocks noChangeAspect="1"/>
+                    </pic:cNvPicPr>
+                  </pic:nvPicPr>
+                  <pic:blipFill>
+                    <a:blip r:embed="rId16"/>
+                    <a:srcRect/>
+                    <a:stretch/>
+                  </pic:blipFill>
+                  <pic:spPr>
+                    <a:xfrm>
+                      <a:off x="0" y="0"/>
+                      <a:ext cx="6217200" cy="2641501"/>
+                    </a:xfrm>
+                    <a:prstGeom prst="rect">
+                      <a:avLst/>
+                    </a:prstGeom>
+                  </pic:spPr>
+                </pic:pic>
+              </a:graphicData>
+            </a:graphic>
+          </wp:inline>
+        </w:drawing>
+      </w:r>
+    </w:p>
+    <w:p/>
+    <w:p>
+      <w:pPr>
+        <w:numPr>
+          <w:ilvl w:val="0"/>
+          <w:numId w:val="7"/>
+        </w:numPr>
+      </w:pPr>
+      <w:r>
+        <w:rPr>
+          <w:b/>
+          <w:bCs/>
+        </w:rPr>
+        <w:t>Lógica de decisión:</w:t>
+      </w:r>
+      <w:r>
+        <w:t xml:space="preserve"> Revisa si el acceso ocurre fuera del turno asignado al empleado y si fue exitoso, para revisarlo con contexto o solo registrarlo.</w:t>
+      </w:r>
+    </w:p>
+    <w:p>
+      <w:pPr>
+        <w:numPr>
+          <w:ilvl w:val="0"/>
+          <w:numId w:val="7"/>
+        </w:numPr>
+      </w:pPr>
+      <w:r>
+        <w:rPr>
+          <w:b/>
+          <w:bCs/>
+        </w:rPr>
+        <w:t>Evidencia y limitaciones:</w:t>
+      </w:r>
+      <w:r>
+        <w:t xml:space="preserve"> Las horas están en UTC y los turnos son sintéticos. La señal casi no separa clases: fuera de turno en el 64,4 % de los ATO frente al 60,5 % de los no ATO (D6).</w:t>
+      </w:r>
+    </w:p>
+    <w:p/>
+    <w:p>
+      <w:pPr>
+        <w:rPr>
+          <w:b/>
+          <w:bCs/>
+        </w:rPr>
+      </w:pPr>
+    </w:p>
+    <w:p>
+      <w:pPr>
+        <w:rPr>
+          <w:b/>
+          <w:bCs/>
+        </w:rPr>
+      </w:pPr>
+    </w:p>
+    <w:p>
+      <w:pPr>
+        <w:rPr>
+          <w:b/>
+          <w:bCs/>
+        </w:rPr>
+      </w:pPr>
+    </w:p>
+    <w:p>
+      <w:pPr>
+        <w:rPr>
+          <w:b/>
+          <w:bCs/>
+        </w:rPr>
+      </w:pPr>
+    </w:p>
+    <w:p>
+      <w:pPr>
+        <w:rPr>
+          <w:b/>
+          <w:bCs/>
+        </w:rPr>
+      </w:pPr>
+    </w:p>
+    <w:p>
+      <w:pPr>
+        <w:rPr>
+          <w:b/>
+          <w:bCs/>
+        </w:rPr>
+      </w:pPr>
+    </w:p>
+    <w:p>
+      <w:pPr>
+        <w:rPr>
+          <w:b/>
+          <w:bCs/>
+        </w:rPr>
+      </w:pPr>
+    </w:p>
+    <w:p>
+      <w:pPr>
+        <w:rPr>
+          <w:b/>
+          <w:bCs/>
+        </w:rPr>
+      </w:pPr>
+    </w:p>
+    <w:p>
+      <w:pPr>
+        <w:rPr>
+          <w:b/>
+          <w:bCs/>
+        </w:rPr>
+      </w:pPr>
+      <w:r>
+        <w:rPr>
+          <w:b/>
+          <w:bCs/>
+        </w:rPr>
+        <w:lastRenderedPageBreak/>
+        <w:t>Árbol 5 · Señales combinadas</w:t>
+      </w:r>
+    </w:p>
+    <w:p>
+      <w:pPr>
+        <w:rPr>
+          <w:b/>
+          <w:bCs/>
+        </w:rPr>
+      </w:pPr>
+      <w:r>
+        <w:rPr>
+          <w:noProof/>
+        </w:rPr>
+        <w:drawing>
+          <wp:inline distT="0" distB="0" distL="0" distR="0" wp14:anchorId="562EA133" wp14:editId="44929EBE">
+            <wp:extent cx="5859780" cy="2489644"/>
+            <wp:effectExtent l="0" t="0" r="7620" b="6350"/>
+            <wp:docPr id="7" name="Image 4" descr="Árbol 5: señales combinadas: ejemplo didáctico, no es un modelo entrenado"/>
+            <wp:cNvGraphicFramePr>
+              <a:graphicFrameLocks xmlns:a="http://schemas.openxmlformats.org/drawingml/2006/main" noChangeAspect="1"/>
+            </wp:cNvGraphicFramePr>
+            <a:graphic xmlns:a="http://schemas.openxmlformats.org/drawingml/2006/main">
+              <a:graphicData uri="http://schemas.openxmlformats.org/drawingml/2006/picture">
+                <pic:pic xmlns:pic="http://schemas.openxmlformats.org/drawingml/2006/picture">
+                  <pic:nvPicPr>
+                    <pic:cNvPr id="7" name="Image 4" descr="Árbol 5: señales combinadas: ejemplo didáctico, no es un modelo entrenado"/>
+                    <pic:cNvPicPr>
+                      <a:picLocks noChangeAspect="1"/>
+                    </pic:cNvPicPr>
+                  </pic:nvPicPr>
+                  <pic:blipFill>
+                    <a:blip r:embed="rId17"/>
+                    <a:srcRect/>
+                    <a:stretch/>
+                  </pic:blipFill>
+                  <pic:spPr>
+                    <a:xfrm>
+                      <a:off x="0" y="0"/>
+                      <a:ext cx="5880049" cy="2498256"/>
+                    </a:xfrm>
+                    <a:prstGeom prst="rect">
+                      <a:avLst/>
+                    </a:prstGeom>
+                  </pic:spPr>
+                </pic:pic>
+              </a:graphicData>
+            </a:graphic>
+          </wp:inline>
+        </w:drawing>
+      </w:r>
+    </w:p>
+    <w:p>
+      <w:pPr>
+        <w:numPr>
+          <w:ilvl w:val="0"/>
+          <w:numId w:val="7"/>
+        </w:numPr>
+      </w:pPr>
+      <w:r>
+        <w:rPr>
+          <w:b/>
+          <w:bCs/>
+        </w:rPr>
+        <w:t>Lógica de decisión:</w:t>
+      </w:r>
+      <w:r>
+        <w:t xml:space="preserve"> Combina fallos recientes o IP sospechosa con país distinto u horario fuera de turno, y añade si una cuenta inactiva tuvo acceso exitoso. Cuantas más señales coinciden, mayor es la prioridad.</w:t>
+      </w:r>
+    </w:p>
+    <w:p>
+      <w:pPr>
+        <w:numPr>
+          <w:ilvl w:val="0"/>
+          <w:numId w:val="7"/>
+        </w:numPr>
+      </w:pPr>
+      <w:r>
+        <w:rPr>
+          <w:b/>
+          <w:bCs/>
+        </w:rPr>
+        <w:t>Evidencia y limitaciones:</w:t>
+      </w:r>
+      <w:r>
+        <w:t xml:space="preserve"> Es un análisis descriptivo: 7 de 45 ATO (15,6 %) reúnen 3 señales frente al 8,9 % de los no ATO. Con tan pocos eventos, no demuestra capacidad predictiva.</w:t>
+      </w:r>
+    </w:p>
+    <w:p/>
+    <w:p>
+      <w:pPr>
+        <w:rPr>
+          <w:b/>
+          <w:bCs/>
+        </w:rPr>
+      </w:pPr>
       <w:r>
         <w:rPr>
           <w:b/>
@@ -2492,119 +3282,6 @@
       <w:r>
         <w:lastRenderedPageBreak/>
         <w:t>entrenamiento constituirán un artefacto del sobremuestreo y no una prueba de aprendizaje generalizable.</w:t>
-      </w:r>
-    </w:p>
-    <w:p>
-      <w:pPr>
-        <w:rPr>
-          <w:b/>
-          <w:bCs/>
-        </w:rPr>
-      </w:pPr>
-      <w:r>
-        <w:rPr>
-          <w:b/>
-          <w:bCs/>
-        </w:rPr>
-        <w:t>6. CONCLUSIONES Y RECOMENDACIONES (PRÓXIMOS PASOS)</w:t>
-      </w:r>
-    </w:p>
-    <w:p>
-      <w:pPr>
-        <w:numPr>
-          <w:ilvl w:val="0"/>
-          <w:numId w:val="11"/>
-        </w:numPr>
-      </w:pPr>
-      <w:r>
-        <w:rPr>
-          <w:b/>
-          <w:bCs/>
-        </w:rPr>
-        <w:t>Aceptación de la Fase de Preparación:</w:t>
-      </w:r>
-      <w:r>
-        <w:t xml:space="preserve"> Se recomienda mantener las variables generadas en la Fase 3 de CRISP-DM[cite: 2], documentando formalmente la limitación de impossible_travel para una iteración futura donde se amplíe el diccionario de centroides.</w:t>
-      </w:r>
-    </w:p>
-    <w:p>
-      <w:pPr>
-        <w:numPr>
-          <w:ilvl w:val="0"/>
-          <w:numId w:val="11"/>
-        </w:numPr>
-      </w:pPr>
-      <w:r>
-        <w:rPr>
-          <w:b/>
-          <w:bCs/>
-        </w:rPr>
-        <w:t>Estrategia de Modelado:</w:t>
-      </w:r>
-      <w:r>
-        <w:t xml:space="preserve"> Al entrenar el árbol de decisión, se deberán ajustar los </w:t>
-      </w:r>
-      <w:proofErr w:type="spellStart"/>
-      <w:r>
-        <w:t>hiperparámetros</w:t>
-      </w:r>
-      <w:proofErr w:type="spellEnd"/>
-      <w:r>
-        <w:t xml:space="preserve"> de poda (</w:t>
-      </w:r>
-      <w:proofErr w:type="spellStart"/>
-      <w:r>
-        <w:t>max_depth</w:t>
-      </w:r>
-      <w:proofErr w:type="spellEnd"/>
-      <w:r>
-        <w:t xml:space="preserve">, </w:t>
-      </w:r>
-      <w:proofErr w:type="spellStart"/>
-      <w:r>
-        <w:t>min_samples_leaf</w:t>
-      </w:r>
-      <w:proofErr w:type="spellEnd"/>
-      <w:r>
-        <w:t>) para evitar que el algoritmo memorice exactamente los 36 patrones duplicados.</w:t>
-      </w:r>
-    </w:p>
-    <w:p>
-      <w:pPr>
-        <w:numPr>
-          <w:ilvl w:val="0"/>
-          <w:numId w:val="11"/>
-        </w:numPr>
-      </w:pPr>
-      <w:r>
-        <w:rPr>
-          <w:b/>
-          <w:bCs/>
-        </w:rPr>
-        <w:t>Reporte de Métricas:</w:t>
-      </w:r>
-      <w:r>
-        <w:t xml:space="preserve"> En la Fase de Evaluación (CRISP-DM Fase 5), los resultados de evaluación deberán presentarse mediante la matriz de confusión con valores absolutos junto a los porcentajes de </w:t>
-      </w:r>
-      <w:r>
-        <w:rPr>
-          <w:i/>
-          <w:iCs/>
-        </w:rPr>
-        <w:t>Recall</w:t>
-      </w:r>
-      <w:r>
-        <w:t xml:space="preserve"> y </w:t>
-      </w:r>
-      <w:r>
-        <w:rPr>
-          <w:i/>
-          <w:iCs/>
-        </w:rPr>
-        <w:t>F1-Score</w:t>
-      </w:r>
-      <w:r>
-        <w:t>, transparentando el tamaño reducido de la clase positiva en prueba.</w:t>
       </w:r>
     </w:p>
     <w:p/>

</xml_diff>